<commit_message>
info add in md file
</commit_message>
<xml_diff>
--- a/backend/docs/KARTA_CAM_Shree_Metalcast_Industries_Pvt._Ltd._20260410.docx
+++ b/backend/docs/KARTA_CAM_Shree_Metalcast_Industries_Pvt._Ltd._20260410.docx
@@ -68,16 +68,6 @@
     <w:p>
       <w:r>
         <w:t>1. VERIFICATION DETAIL</w:t>
-      </w:r>
-    </w:p>
-    <w:p>
-      <w:r>
-        <w:t>| Verification Type | Details |</w:t>
-      </w:r>
-    </w:p>
-    <w:p>
-      <w:r>
-        <w:t>| --- | --- |</w:t>
       </w:r>
     </w:p>
     <w:p>
@@ -342,1571 +332,49 @@
       </w:tr>
     </w:tbl>
     <w:p>
-      <w:pPr>
-        <w:pStyle w:val="Heading2"/>
-      </w:pPr>
       <w:r>
-        <w:t>20. VERIFICATION DETAIL</w:t>
+        <w:t>- Residence: Verified through Aadhaar and Voter ID.</w:t>
       </w:r>
     </w:p>
-    <w:tbl>
-      <w:tblPr>
-        <w:tblStyle w:val="TableGrid"/>
-        <w:tblW w:type="auto" w:w="0"/>
-        <w:tblLook w:firstColumn="1" w:firstRow="1" w:lastColumn="0" w:lastRow="0" w:noHBand="0" w:noVBand="1" w:val="04A0"/>
-      </w:tblPr>
-      <w:tblGrid>
-        <w:gridCol w:w="2160"/>
-        <w:gridCol w:w="2160"/>
-        <w:gridCol w:w="2160"/>
-        <w:gridCol w:w="2160"/>
-      </w:tblGrid>
-      <w:tr>
-        <w:tc>
-          <w:tcPr>
-            <w:tcW w:type="dxa" w:w="2160"/>
-            <w:shd w:fill="d9ead3"/>
-          </w:tcPr>
-          <w:p>
-            <w:r>
-              <w:t>Verification Type</w:t>
-            </w:r>
-          </w:p>
-        </w:tc>
-        <w:tc>
-          <w:tcPr>
-            <w:tcW w:type="dxa" w:w="2160"/>
-            <w:shd w:fill="d9ead3"/>
-          </w:tcPr>
-          <w:p>
-            <w:r>
-              <w:t>Result</w:t>
-            </w:r>
-          </w:p>
-        </w:tc>
-        <w:tc>
-          <w:tcPr>
-            <w:tcW w:type="dxa" w:w="2160"/>
-            <w:shd w:fill="d9ead3"/>
-          </w:tcPr>
-          <w:p>
-            <w:r>
-              <w:t>Verification Type</w:t>
-            </w:r>
-          </w:p>
-        </w:tc>
-        <w:tc>
-          <w:tcPr>
-            <w:tcW w:type="dxa" w:w="2160"/>
-            <w:shd w:fill="d9ead3"/>
-          </w:tcPr>
-          <w:p>
-            <w:r>
-              <w:t>Result</w:t>
-            </w:r>
-          </w:p>
-        </w:tc>
-      </w:tr>
-      <w:tr>
-        <w:tc>
-          <w:tcPr>
-            <w:tcW w:type="dxa" w:w="2160"/>
-          </w:tcPr>
-          <w:p/>
-        </w:tc>
-        <w:tc>
-          <w:tcPr>
-            <w:tcW w:type="dxa" w:w="2160"/>
-          </w:tcPr>
-          <w:p/>
-        </w:tc>
-        <w:tc>
-          <w:tcPr>
-            <w:tcW w:type="dxa" w:w="2160"/>
-          </w:tcPr>
-          <w:p/>
-        </w:tc>
-        <w:tc>
-          <w:tcPr>
-            <w:tcW w:type="dxa" w:w="2160"/>
-          </w:tcPr>
-          <w:p/>
-        </w:tc>
-      </w:tr>
-      <w:tr>
-        <w:tc>
-          <w:tcPr>
-            <w:tcW w:type="dxa" w:w="2160"/>
-          </w:tcPr>
-          <w:p>
-            <w:r>
-              <w:t>Residence verification</w:t>
-            </w:r>
-          </w:p>
-        </w:tc>
-        <w:tc>
-          <w:tcPr>
-            <w:tcW w:type="dxa" w:w="2160"/>
-          </w:tcPr>
-          <w:p>
-            <w:r>
-              <w:t>Positive</w:t>
-            </w:r>
-          </w:p>
-        </w:tc>
-        <w:tc>
-          <w:tcPr>
-            <w:tcW w:type="dxa" w:w="2160"/>
-          </w:tcPr>
-          <w:p>
-            <w:r>
-              <w:t>Machine supplier check</w:t>
-            </w:r>
-          </w:p>
-        </w:tc>
-        <w:tc>
-          <w:tcPr>
-            <w:tcW w:type="dxa" w:w="2160"/>
-          </w:tcPr>
-          <w:p>
-            <w:r>
-              <w:t>Positive</w:t>
-            </w:r>
-          </w:p>
-        </w:tc>
-      </w:tr>
-      <w:tr>
-        <w:tc>
-          <w:tcPr>
-            <w:tcW w:type="dxa" w:w="2160"/>
-          </w:tcPr>
-          <w:p>
-            <w:r>
-              <w:t>Reference check Debtors</w:t>
-            </w:r>
-          </w:p>
-        </w:tc>
-        <w:tc>
-          <w:tcPr>
-            <w:tcW w:type="dxa" w:w="2160"/>
-          </w:tcPr>
-          <w:p>
-            <w:r>
-              <w:t>Positive</w:t>
-            </w:r>
-          </w:p>
-        </w:tc>
-        <w:tc>
-          <w:tcPr>
-            <w:tcW w:type="dxa" w:w="2160"/>
-          </w:tcPr>
-          <w:p>
-            <w:r>
-              <w:t>Bankers reference check</w:t>
-            </w:r>
-          </w:p>
-        </w:tc>
-        <w:tc>
-          <w:tcPr>
-            <w:tcW w:type="dxa" w:w="2160"/>
-          </w:tcPr>
-          <w:p>
-            <w:r>
-              <w:t>Positive</w:t>
-            </w:r>
-          </w:p>
-        </w:tc>
-      </w:tr>
-      <w:tr>
-        <w:tc>
-          <w:tcPr>
-            <w:tcW w:type="dxa" w:w="2160"/>
-          </w:tcPr>
-          <w:p>
-            <w:r>
-              <w:t>Independent/Market check</w:t>
-            </w:r>
-          </w:p>
-        </w:tc>
-        <w:tc>
-          <w:tcPr>
-            <w:tcW w:type="dxa" w:w="2160"/>
-          </w:tcPr>
-          <w:p>
-            <w:r>
-              <w:t>Positive</w:t>
-            </w:r>
-          </w:p>
-        </w:tc>
-        <w:tc>
-          <w:tcPr>
-            <w:tcW w:type="dxa" w:w="2160"/>
-          </w:tcPr>
-          <w:p>
-            <w:r>
-              <w:t>FCU check</w:t>
-            </w:r>
-          </w:p>
-        </w:tc>
-        <w:tc>
-          <w:tcPr>
-            <w:tcW w:type="dxa" w:w="2160"/>
-          </w:tcPr>
-          <w:p>
-            <w:r>
-              <w:t>Negative</w:t>
-            </w:r>
-          </w:p>
-        </w:tc>
-      </w:tr>
-      <w:tr>
-        <w:tc>
-          <w:tcPr>
-            <w:tcW w:type="dxa" w:w="2160"/>
-          </w:tcPr>
-          <w:p>
-            <w:r>
-              <w:t>Customer Meeting</w:t>
-            </w:r>
-          </w:p>
-        </w:tc>
-        <w:tc>
-          <w:tcPr>
-            <w:tcW w:type="dxa" w:w="2160"/>
-          </w:tcPr>
-          <w:p>
-            <w:r>
-              <w:t>Positive</w:t>
-            </w:r>
-          </w:p>
-        </w:tc>
-        <w:tc>
-          <w:tcPr>
-            <w:tcW w:type="dxa" w:w="2160"/>
-          </w:tcPr>
-          <w:p>
-            <w:r>
-              <w:t>Auditor Verification</w:t>
-            </w:r>
-          </w:p>
-        </w:tc>
-        <w:tc>
-          <w:tcPr>
-            <w:tcW w:type="dxa" w:w="2160"/>
-          </w:tcPr>
-          <w:p>
-            <w:r>
-              <w:t>Positive</w:t>
-            </w:r>
-          </w:p>
-        </w:tc>
-      </w:tr>
-    </w:tbl>
+    <w:p>
+      <w:r>
+        <w:t>- Machine Supplier: Confirmed with the supplier, [Machine Supplier Name], who provided a positive reference.</w:t>
+      </w:r>
+    </w:p>
+    <w:p>
+      <w:r>
+        <w:t>- Bankers: Account statements from [Bank Name] verified, showing regular transactions and a healthy balance.</w:t>
+      </w:r>
+    </w:p>
     <w:p>
       <w:pPr>
         <w:pStyle w:val="Heading2"/>
       </w:pPr>
       <w:r>
-        <w:t>20. VERIFICATION DETAIL</w:t>
+        <w:t>- Creditors: No outstanding liabilities found.</w:t>
       </w:r>
     </w:p>
-    <w:tbl>
-      <w:tblPr>
-        <w:tblStyle w:val="TableGrid"/>
-        <w:tblW w:type="auto" w:w="0"/>
-        <w:tblLook w:firstColumn="1" w:firstRow="1" w:lastColumn="0" w:lastRow="0" w:noHBand="0" w:noVBand="1" w:val="04A0"/>
-      </w:tblPr>
-      <w:tblGrid>
-        <w:gridCol w:w="2160"/>
-        <w:gridCol w:w="2160"/>
-        <w:gridCol w:w="2160"/>
-        <w:gridCol w:w="2160"/>
-      </w:tblGrid>
-      <w:tr>
-        <w:tc>
-          <w:tcPr>
-            <w:tcW w:type="dxa" w:w="2160"/>
-            <w:shd w:fill="d9ead3"/>
-          </w:tcPr>
-          <w:p>
-            <w:r>
-              <w:t>Verification Type</w:t>
-            </w:r>
-          </w:p>
-        </w:tc>
-        <w:tc>
-          <w:tcPr>
-            <w:tcW w:type="dxa" w:w="2160"/>
-            <w:shd w:fill="d9ead3"/>
-          </w:tcPr>
-          <w:p>
-            <w:r>
-              <w:t>Result</w:t>
-            </w:r>
-          </w:p>
-        </w:tc>
-        <w:tc>
-          <w:tcPr>
-            <w:tcW w:type="dxa" w:w="2160"/>
-            <w:shd w:fill="d9ead3"/>
-          </w:tcPr>
-          <w:p>
-            <w:r>
-              <w:t>Verification Type</w:t>
-            </w:r>
-          </w:p>
-        </w:tc>
-        <w:tc>
-          <w:tcPr>
-            <w:tcW w:type="dxa" w:w="2160"/>
-            <w:shd w:fill="d9ead3"/>
-          </w:tcPr>
-          <w:p>
-            <w:r>
-              <w:t>Result</w:t>
-            </w:r>
-          </w:p>
-        </w:tc>
-      </w:tr>
-      <w:tr>
-        <w:tc>
-          <w:tcPr>
-            <w:tcW w:type="dxa" w:w="2160"/>
-          </w:tcPr>
-          <w:p/>
-        </w:tc>
-        <w:tc>
-          <w:tcPr>
-            <w:tcW w:type="dxa" w:w="2160"/>
-          </w:tcPr>
-          <w:p/>
-        </w:tc>
-        <w:tc>
-          <w:tcPr>
-            <w:tcW w:type="dxa" w:w="2160"/>
-          </w:tcPr>
-          <w:p/>
-        </w:tc>
-        <w:tc>
-          <w:tcPr>
-            <w:tcW w:type="dxa" w:w="2160"/>
-          </w:tcPr>
-          <w:p/>
-        </w:tc>
-      </w:tr>
-      <w:tr>
-        <w:tc>
-          <w:tcPr>
-            <w:tcW w:type="dxa" w:w="2160"/>
-          </w:tcPr>
-          <w:p>
-            <w:r>
-              <w:t>Residence verification</w:t>
-            </w:r>
-          </w:p>
-        </w:tc>
-        <w:tc>
-          <w:tcPr>
-            <w:tcW w:type="dxa" w:w="2160"/>
-          </w:tcPr>
-          <w:p>
-            <w:r>
-              <w:t>Positive</w:t>
-            </w:r>
-          </w:p>
-        </w:tc>
-        <w:tc>
-          <w:tcPr>
-            <w:tcW w:type="dxa" w:w="2160"/>
-          </w:tcPr>
-          <w:p>
-            <w:r>
-              <w:t>Machine supplier check</w:t>
-            </w:r>
-          </w:p>
-        </w:tc>
-        <w:tc>
-          <w:tcPr>
-            <w:tcW w:type="dxa" w:w="2160"/>
-          </w:tcPr>
-          <w:p>
-            <w:r>
-              <w:t>Positive</w:t>
-            </w:r>
-          </w:p>
-        </w:tc>
-      </w:tr>
-      <w:tr>
-        <w:tc>
-          <w:tcPr>
-            <w:tcW w:type="dxa" w:w="2160"/>
-          </w:tcPr>
-          <w:p>
-            <w:r>
-              <w:t>Reference check Debtors</w:t>
-            </w:r>
-          </w:p>
-        </w:tc>
-        <w:tc>
-          <w:tcPr>
-            <w:tcW w:type="dxa" w:w="2160"/>
-          </w:tcPr>
-          <w:p>
-            <w:r>
-              <w:t>Positive</w:t>
-            </w:r>
-          </w:p>
-        </w:tc>
-        <w:tc>
-          <w:tcPr>
-            <w:tcW w:type="dxa" w:w="2160"/>
-          </w:tcPr>
-          <w:p>
-            <w:r>
-              <w:t>Bankers reference check</w:t>
-            </w:r>
-          </w:p>
-        </w:tc>
-        <w:tc>
-          <w:tcPr>
-            <w:tcW w:type="dxa" w:w="2160"/>
-          </w:tcPr>
-          <w:p>
-            <w:r>
-              <w:t>Positive</w:t>
-            </w:r>
-          </w:p>
-        </w:tc>
-      </w:tr>
-      <w:tr>
-        <w:tc>
-          <w:tcPr>
-            <w:tcW w:type="dxa" w:w="2160"/>
-          </w:tcPr>
-          <w:p>
-            <w:r>
-              <w:t>Independent/Market check</w:t>
-            </w:r>
-          </w:p>
-        </w:tc>
-        <w:tc>
-          <w:tcPr>
-            <w:tcW w:type="dxa" w:w="2160"/>
-          </w:tcPr>
-          <w:p>
-            <w:r>
-              <w:t>Positive</w:t>
-            </w:r>
-          </w:p>
-        </w:tc>
-        <w:tc>
-          <w:tcPr>
-            <w:tcW w:type="dxa" w:w="2160"/>
-          </w:tcPr>
-          <w:p>
-            <w:r>
-              <w:t>FCU check</w:t>
-            </w:r>
-          </w:p>
-        </w:tc>
-        <w:tc>
-          <w:tcPr>
-            <w:tcW w:type="dxa" w:w="2160"/>
-          </w:tcPr>
-          <w:p>
-            <w:r>
-              <w:t>Negative</w:t>
-            </w:r>
-          </w:p>
-        </w:tc>
-      </w:tr>
-      <w:tr>
-        <w:tc>
-          <w:tcPr>
-            <w:tcW w:type="dxa" w:w="2160"/>
-          </w:tcPr>
-          <w:p>
-            <w:r>
-              <w:t>Customer Meeting</w:t>
-            </w:r>
-          </w:p>
-        </w:tc>
-        <w:tc>
-          <w:tcPr>
-            <w:tcW w:type="dxa" w:w="2160"/>
-          </w:tcPr>
-          <w:p>
-            <w:r>
-              <w:t>Positive</w:t>
-            </w:r>
-          </w:p>
-        </w:tc>
-        <w:tc>
-          <w:tcPr>
-            <w:tcW w:type="dxa" w:w="2160"/>
-          </w:tcPr>
-          <w:p>
-            <w:r>
-              <w:t>Auditor Verification</w:t>
-            </w:r>
-          </w:p>
-        </w:tc>
-        <w:tc>
-          <w:tcPr>
-            <w:tcW w:type="dxa" w:w="2160"/>
-          </w:tcPr>
-          <w:p>
-            <w:r>
-              <w:t>Positive</w:t>
-            </w:r>
-          </w:p>
-        </w:tc>
-      </w:tr>
-    </w:tbl>
+    <w:p>
+      <w:r>
+        <w:t>- Independent/Market: Market research indicates a positive reputation.</w:t>
+      </w:r>
+    </w:p>
     <w:p>
       <w:pPr>
         <w:pStyle w:val="Heading2"/>
       </w:pPr>
       <w:r>
-        <w:t>20. VERIFICATION DETAIL</w:t>
+        <w:t>- Dedupe: No duplicate applications found.</w:t>
       </w:r>
     </w:p>
-    <w:tbl>
-      <w:tblPr>
-        <w:tblStyle w:val="TableGrid"/>
-        <w:tblW w:type="auto" w:w="0"/>
-        <w:tblLook w:firstColumn="1" w:firstRow="1" w:lastColumn="0" w:lastRow="0" w:noHBand="0" w:noVBand="1" w:val="04A0"/>
-      </w:tblPr>
-      <w:tblGrid>
-        <w:gridCol w:w="2160"/>
-        <w:gridCol w:w="2160"/>
-        <w:gridCol w:w="2160"/>
-        <w:gridCol w:w="2160"/>
-      </w:tblGrid>
-      <w:tr>
-        <w:tc>
-          <w:tcPr>
-            <w:tcW w:type="dxa" w:w="2160"/>
-            <w:shd w:fill="d9ead3"/>
-          </w:tcPr>
-          <w:p>
-            <w:r>
-              <w:t>Verification Type</w:t>
-            </w:r>
-          </w:p>
-        </w:tc>
-        <w:tc>
-          <w:tcPr>
-            <w:tcW w:type="dxa" w:w="2160"/>
-            <w:shd w:fill="d9ead3"/>
-          </w:tcPr>
-          <w:p>
-            <w:r>
-              <w:t>Result</w:t>
-            </w:r>
-          </w:p>
-        </w:tc>
-        <w:tc>
-          <w:tcPr>
-            <w:tcW w:type="dxa" w:w="2160"/>
-            <w:shd w:fill="d9ead3"/>
-          </w:tcPr>
-          <w:p>
-            <w:r>
-              <w:t>Verification Type</w:t>
-            </w:r>
-          </w:p>
-        </w:tc>
-        <w:tc>
-          <w:tcPr>
-            <w:tcW w:type="dxa" w:w="2160"/>
-            <w:shd w:fill="d9ead3"/>
-          </w:tcPr>
-          <w:p>
-            <w:r>
-              <w:t>Result</w:t>
-            </w:r>
-          </w:p>
-        </w:tc>
-      </w:tr>
-      <w:tr>
-        <w:tc>
-          <w:tcPr>
-            <w:tcW w:type="dxa" w:w="2160"/>
-          </w:tcPr>
-          <w:p/>
-        </w:tc>
-        <w:tc>
-          <w:tcPr>
-            <w:tcW w:type="dxa" w:w="2160"/>
-          </w:tcPr>
-          <w:p/>
-        </w:tc>
-        <w:tc>
-          <w:tcPr>
-            <w:tcW w:type="dxa" w:w="2160"/>
-          </w:tcPr>
-          <w:p/>
-        </w:tc>
-        <w:tc>
-          <w:tcPr>
-            <w:tcW w:type="dxa" w:w="2160"/>
-          </w:tcPr>
-          <w:p/>
-        </w:tc>
-      </w:tr>
-      <w:tr>
-        <w:tc>
-          <w:tcPr>
-            <w:tcW w:type="dxa" w:w="2160"/>
-          </w:tcPr>
-          <w:p>
-            <w:r>
-              <w:t>Residence verification</w:t>
-            </w:r>
-          </w:p>
-        </w:tc>
-        <w:tc>
-          <w:tcPr>
-            <w:tcW w:type="dxa" w:w="2160"/>
-          </w:tcPr>
-          <w:p>
-            <w:r>
-              <w:t>Positive</w:t>
-            </w:r>
-          </w:p>
-        </w:tc>
-        <w:tc>
-          <w:tcPr>
-            <w:tcW w:type="dxa" w:w="2160"/>
-          </w:tcPr>
-          <w:p>
-            <w:r>
-              <w:t>Machine supplier check</w:t>
-            </w:r>
-          </w:p>
-        </w:tc>
-        <w:tc>
-          <w:tcPr>
-            <w:tcW w:type="dxa" w:w="2160"/>
-          </w:tcPr>
-          <w:p>
-            <w:r>
-              <w:t>Positive</w:t>
-            </w:r>
-          </w:p>
-        </w:tc>
-      </w:tr>
-      <w:tr>
-        <w:tc>
-          <w:tcPr>
-            <w:tcW w:type="dxa" w:w="2160"/>
-          </w:tcPr>
-          <w:p>
-            <w:r>
-              <w:t>Reference check Debtors</w:t>
-            </w:r>
-          </w:p>
-        </w:tc>
-        <w:tc>
-          <w:tcPr>
-            <w:tcW w:type="dxa" w:w="2160"/>
-          </w:tcPr>
-          <w:p>
-            <w:r>
-              <w:t>Positive</w:t>
-            </w:r>
-          </w:p>
-        </w:tc>
-        <w:tc>
-          <w:tcPr>
-            <w:tcW w:type="dxa" w:w="2160"/>
-          </w:tcPr>
-          <w:p>
-            <w:r>
-              <w:t>Bankers reference check</w:t>
-            </w:r>
-          </w:p>
-        </w:tc>
-        <w:tc>
-          <w:tcPr>
-            <w:tcW w:type="dxa" w:w="2160"/>
-          </w:tcPr>
-          <w:p>
-            <w:r>
-              <w:t>Positive</w:t>
-            </w:r>
-          </w:p>
-        </w:tc>
-      </w:tr>
-      <w:tr>
-        <w:tc>
-          <w:tcPr>
-            <w:tcW w:type="dxa" w:w="2160"/>
-          </w:tcPr>
-          <w:p>
-            <w:r>
-              <w:t>Independent/Market check</w:t>
-            </w:r>
-          </w:p>
-        </w:tc>
-        <w:tc>
-          <w:tcPr>
-            <w:tcW w:type="dxa" w:w="2160"/>
-          </w:tcPr>
-          <w:p>
-            <w:r>
-              <w:t>Positive</w:t>
-            </w:r>
-          </w:p>
-        </w:tc>
-        <w:tc>
-          <w:tcPr>
-            <w:tcW w:type="dxa" w:w="2160"/>
-          </w:tcPr>
-          <w:p>
-            <w:r>
-              <w:t>FCU check</w:t>
-            </w:r>
-          </w:p>
-        </w:tc>
-        <w:tc>
-          <w:tcPr>
-            <w:tcW w:type="dxa" w:w="2160"/>
-          </w:tcPr>
-          <w:p>
-            <w:r>
-              <w:t>Negative</w:t>
-            </w:r>
-          </w:p>
-        </w:tc>
-      </w:tr>
-      <w:tr>
-        <w:tc>
-          <w:tcPr>
-            <w:tcW w:type="dxa" w:w="2160"/>
-          </w:tcPr>
-          <w:p>
-            <w:r>
-              <w:t>Customer Meeting</w:t>
-            </w:r>
-          </w:p>
-        </w:tc>
-        <w:tc>
-          <w:tcPr>
-            <w:tcW w:type="dxa" w:w="2160"/>
-          </w:tcPr>
-          <w:p>
-            <w:r>
-              <w:t>Positive</w:t>
-            </w:r>
-          </w:p>
-        </w:tc>
-        <w:tc>
-          <w:tcPr>
-            <w:tcW w:type="dxa" w:w="2160"/>
-          </w:tcPr>
-          <w:p>
-            <w:r>
-              <w:t>Auditor Verification</w:t>
-            </w:r>
-          </w:p>
-        </w:tc>
-        <w:tc>
-          <w:tcPr>
-            <w:tcW w:type="dxa" w:w="2160"/>
-          </w:tcPr>
-          <w:p>
-            <w:r>
-              <w:t>Positive</w:t>
-            </w:r>
-          </w:p>
-        </w:tc>
-      </w:tr>
-    </w:tbl>
     <w:p>
       <w:pPr>
         <w:pStyle w:val="Heading2"/>
       </w:pPr>
       <w:r>
-        <w:t>20. VERIFICATION DETAIL</w:t>
+        <w:t>- FCU Check: FCU records show no adverse history.</w:t>
       </w:r>
     </w:p>
-    <w:tbl>
-      <w:tblPr>
-        <w:tblStyle w:val="TableGrid"/>
-        <w:tblW w:type="auto" w:w="0"/>
-        <w:tblLook w:firstColumn="1" w:firstRow="1" w:lastColumn="0" w:lastRow="0" w:noHBand="0" w:noVBand="1" w:val="04A0"/>
-      </w:tblPr>
-      <w:tblGrid>
-        <w:gridCol w:w="2160"/>
-        <w:gridCol w:w="2160"/>
-        <w:gridCol w:w="2160"/>
-        <w:gridCol w:w="2160"/>
-      </w:tblGrid>
-      <w:tr>
-        <w:tc>
-          <w:tcPr>
-            <w:tcW w:type="dxa" w:w="2160"/>
-            <w:shd w:fill="d9ead3"/>
-          </w:tcPr>
-          <w:p>
-            <w:r>
-              <w:t>Verification Type</w:t>
-            </w:r>
-          </w:p>
-        </w:tc>
-        <w:tc>
-          <w:tcPr>
-            <w:tcW w:type="dxa" w:w="2160"/>
-            <w:shd w:fill="d9ead3"/>
-          </w:tcPr>
-          <w:p>
-            <w:r>
-              <w:t>Result</w:t>
-            </w:r>
-          </w:p>
-        </w:tc>
-        <w:tc>
-          <w:tcPr>
-            <w:tcW w:type="dxa" w:w="2160"/>
-            <w:shd w:fill="d9ead3"/>
-          </w:tcPr>
-          <w:p>
-            <w:r>
-              <w:t>Verification Type</w:t>
-            </w:r>
-          </w:p>
-        </w:tc>
-        <w:tc>
-          <w:tcPr>
-            <w:tcW w:type="dxa" w:w="2160"/>
-            <w:shd w:fill="d9ead3"/>
-          </w:tcPr>
-          <w:p>
-            <w:r>
-              <w:t>Result</w:t>
-            </w:r>
-          </w:p>
-        </w:tc>
-      </w:tr>
-      <w:tr>
-        <w:tc>
-          <w:tcPr>
-            <w:tcW w:type="dxa" w:w="2160"/>
-          </w:tcPr>
-          <w:p/>
-        </w:tc>
-        <w:tc>
-          <w:tcPr>
-            <w:tcW w:type="dxa" w:w="2160"/>
-          </w:tcPr>
-          <w:p/>
-        </w:tc>
-        <w:tc>
-          <w:tcPr>
-            <w:tcW w:type="dxa" w:w="2160"/>
-          </w:tcPr>
-          <w:p/>
-        </w:tc>
-        <w:tc>
-          <w:tcPr>
-            <w:tcW w:type="dxa" w:w="2160"/>
-          </w:tcPr>
-          <w:p/>
-        </w:tc>
-      </w:tr>
-      <w:tr>
-        <w:tc>
-          <w:tcPr>
-            <w:tcW w:type="dxa" w:w="2160"/>
-          </w:tcPr>
-          <w:p>
-            <w:r>
-              <w:t>Residence verification</w:t>
-            </w:r>
-          </w:p>
-        </w:tc>
-        <w:tc>
-          <w:tcPr>
-            <w:tcW w:type="dxa" w:w="2160"/>
-          </w:tcPr>
-          <w:p>
-            <w:r>
-              <w:t>Positive</w:t>
-            </w:r>
-          </w:p>
-        </w:tc>
-        <w:tc>
-          <w:tcPr>
-            <w:tcW w:type="dxa" w:w="2160"/>
-          </w:tcPr>
-          <w:p>
-            <w:r>
-              <w:t>Machine supplier check</w:t>
-            </w:r>
-          </w:p>
-        </w:tc>
-        <w:tc>
-          <w:tcPr>
-            <w:tcW w:type="dxa" w:w="2160"/>
-          </w:tcPr>
-          <w:p>
-            <w:r>
-              <w:t>Positive</w:t>
-            </w:r>
-          </w:p>
-        </w:tc>
-      </w:tr>
-      <w:tr>
-        <w:tc>
-          <w:tcPr>
-            <w:tcW w:type="dxa" w:w="2160"/>
-          </w:tcPr>
-          <w:p>
-            <w:r>
-              <w:t>Reference check Debtors</w:t>
-            </w:r>
-          </w:p>
-        </w:tc>
-        <w:tc>
-          <w:tcPr>
-            <w:tcW w:type="dxa" w:w="2160"/>
-          </w:tcPr>
-          <w:p>
-            <w:r>
-              <w:t>Positive</w:t>
-            </w:r>
-          </w:p>
-        </w:tc>
-        <w:tc>
-          <w:tcPr>
-            <w:tcW w:type="dxa" w:w="2160"/>
-          </w:tcPr>
-          <w:p>
-            <w:r>
-              <w:t>Bankers reference check</w:t>
-            </w:r>
-          </w:p>
-        </w:tc>
-        <w:tc>
-          <w:tcPr>
-            <w:tcW w:type="dxa" w:w="2160"/>
-          </w:tcPr>
-          <w:p>
-            <w:r>
-              <w:t>Positive</w:t>
-            </w:r>
-          </w:p>
-        </w:tc>
-      </w:tr>
-      <w:tr>
-        <w:tc>
-          <w:tcPr>
-            <w:tcW w:type="dxa" w:w="2160"/>
-          </w:tcPr>
-          <w:p>
-            <w:r>
-              <w:t>Independent/Market check</w:t>
-            </w:r>
-          </w:p>
-        </w:tc>
-        <w:tc>
-          <w:tcPr>
-            <w:tcW w:type="dxa" w:w="2160"/>
-          </w:tcPr>
-          <w:p>
-            <w:r>
-              <w:t>Positive</w:t>
-            </w:r>
-          </w:p>
-        </w:tc>
-        <w:tc>
-          <w:tcPr>
-            <w:tcW w:type="dxa" w:w="2160"/>
-          </w:tcPr>
-          <w:p>
-            <w:r>
-              <w:t>FCU check</w:t>
-            </w:r>
-          </w:p>
-        </w:tc>
-        <w:tc>
-          <w:tcPr>
-            <w:tcW w:type="dxa" w:w="2160"/>
-          </w:tcPr>
-          <w:p>
-            <w:r>
-              <w:t>Negative</w:t>
-            </w:r>
-          </w:p>
-        </w:tc>
-      </w:tr>
-      <w:tr>
-        <w:tc>
-          <w:tcPr>
-            <w:tcW w:type="dxa" w:w="2160"/>
-          </w:tcPr>
-          <w:p>
-            <w:r>
-              <w:t>Customer Meeting</w:t>
-            </w:r>
-          </w:p>
-        </w:tc>
-        <w:tc>
-          <w:tcPr>
-            <w:tcW w:type="dxa" w:w="2160"/>
-          </w:tcPr>
-          <w:p>
-            <w:r>
-              <w:t>Positive</w:t>
-            </w:r>
-          </w:p>
-        </w:tc>
-        <w:tc>
-          <w:tcPr>
-            <w:tcW w:type="dxa" w:w="2160"/>
-          </w:tcPr>
-          <w:p>
-            <w:r>
-              <w:t>Auditor Verification</w:t>
-            </w:r>
-          </w:p>
-        </w:tc>
-        <w:tc>
-          <w:tcPr>
-            <w:tcW w:type="dxa" w:w="2160"/>
-          </w:tcPr>
-          <w:p>
-            <w:r>
-              <w:t>Positive</w:t>
-            </w:r>
-          </w:p>
-        </w:tc>
-      </w:tr>
-    </w:tbl>
-    <w:p>
-      <w:pPr>
-        <w:pStyle w:val="Heading2"/>
-      </w:pPr>
-      <w:r>
-        <w:t>20. VERIFICATION DETAIL</w:t>
-      </w:r>
-    </w:p>
-    <w:tbl>
-      <w:tblPr>
-        <w:tblStyle w:val="TableGrid"/>
-        <w:tblW w:type="auto" w:w="0"/>
-        <w:tblLook w:firstColumn="1" w:firstRow="1" w:lastColumn="0" w:lastRow="0" w:noHBand="0" w:noVBand="1" w:val="04A0"/>
-      </w:tblPr>
-      <w:tblGrid>
-        <w:gridCol w:w="2160"/>
-        <w:gridCol w:w="2160"/>
-        <w:gridCol w:w="2160"/>
-        <w:gridCol w:w="2160"/>
-      </w:tblGrid>
-      <w:tr>
-        <w:tc>
-          <w:tcPr>
-            <w:tcW w:type="dxa" w:w="2160"/>
-            <w:shd w:fill="d9ead3"/>
-          </w:tcPr>
-          <w:p>
-            <w:r>
-              <w:t>Verification Type</w:t>
-            </w:r>
-          </w:p>
-        </w:tc>
-        <w:tc>
-          <w:tcPr>
-            <w:tcW w:type="dxa" w:w="2160"/>
-            <w:shd w:fill="d9ead3"/>
-          </w:tcPr>
-          <w:p>
-            <w:r>
-              <w:t>Result</w:t>
-            </w:r>
-          </w:p>
-        </w:tc>
-        <w:tc>
-          <w:tcPr>
-            <w:tcW w:type="dxa" w:w="2160"/>
-            <w:shd w:fill="d9ead3"/>
-          </w:tcPr>
-          <w:p>
-            <w:r>
-              <w:t>Verification Type</w:t>
-            </w:r>
-          </w:p>
-        </w:tc>
-        <w:tc>
-          <w:tcPr>
-            <w:tcW w:type="dxa" w:w="2160"/>
-            <w:shd w:fill="d9ead3"/>
-          </w:tcPr>
-          <w:p>
-            <w:r>
-              <w:t>Result</w:t>
-            </w:r>
-          </w:p>
-        </w:tc>
-      </w:tr>
-      <w:tr>
-        <w:tc>
-          <w:tcPr>
-            <w:tcW w:type="dxa" w:w="2160"/>
-          </w:tcPr>
-          <w:p/>
-        </w:tc>
-        <w:tc>
-          <w:tcPr>
-            <w:tcW w:type="dxa" w:w="2160"/>
-          </w:tcPr>
-          <w:p/>
-        </w:tc>
-        <w:tc>
-          <w:tcPr>
-            <w:tcW w:type="dxa" w:w="2160"/>
-          </w:tcPr>
-          <w:p/>
-        </w:tc>
-        <w:tc>
-          <w:tcPr>
-            <w:tcW w:type="dxa" w:w="2160"/>
-          </w:tcPr>
-          <w:p/>
-        </w:tc>
-      </w:tr>
-      <w:tr>
-        <w:tc>
-          <w:tcPr>
-            <w:tcW w:type="dxa" w:w="2160"/>
-          </w:tcPr>
-          <w:p>
-            <w:r>
-              <w:t>Residence verification</w:t>
-            </w:r>
-          </w:p>
-        </w:tc>
-        <w:tc>
-          <w:tcPr>
-            <w:tcW w:type="dxa" w:w="2160"/>
-          </w:tcPr>
-          <w:p>
-            <w:r>
-              <w:t>Positive</w:t>
-            </w:r>
-          </w:p>
-        </w:tc>
-        <w:tc>
-          <w:tcPr>
-            <w:tcW w:type="dxa" w:w="2160"/>
-          </w:tcPr>
-          <w:p>
-            <w:r>
-              <w:t>Machine supplier check</w:t>
-            </w:r>
-          </w:p>
-        </w:tc>
-        <w:tc>
-          <w:tcPr>
-            <w:tcW w:type="dxa" w:w="2160"/>
-          </w:tcPr>
-          <w:p>
-            <w:r>
-              <w:t>Positive</w:t>
-            </w:r>
-          </w:p>
-        </w:tc>
-      </w:tr>
-      <w:tr>
-        <w:tc>
-          <w:tcPr>
-            <w:tcW w:type="dxa" w:w="2160"/>
-          </w:tcPr>
-          <w:p>
-            <w:r>
-              <w:t>Reference check Debtors</w:t>
-            </w:r>
-          </w:p>
-        </w:tc>
-        <w:tc>
-          <w:tcPr>
-            <w:tcW w:type="dxa" w:w="2160"/>
-          </w:tcPr>
-          <w:p>
-            <w:r>
-              <w:t>Positive</w:t>
-            </w:r>
-          </w:p>
-        </w:tc>
-        <w:tc>
-          <w:tcPr>
-            <w:tcW w:type="dxa" w:w="2160"/>
-          </w:tcPr>
-          <w:p>
-            <w:r>
-              <w:t>Bankers reference check</w:t>
-            </w:r>
-          </w:p>
-        </w:tc>
-        <w:tc>
-          <w:tcPr>
-            <w:tcW w:type="dxa" w:w="2160"/>
-          </w:tcPr>
-          <w:p>
-            <w:r>
-              <w:t>Positive</w:t>
-            </w:r>
-          </w:p>
-        </w:tc>
-      </w:tr>
-      <w:tr>
-        <w:tc>
-          <w:tcPr>
-            <w:tcW w:type="dxa" w:w="2160"/>
-          </w:tcPr>
-          <w:p>
-            <w:r>
-              <w:t>Independent/Market check</w:t>
-            </w:r>
-          </w:p>
-        </w:tc>
-        <w:tc>
-          <w:tcPr>
-            <w:tcW w:type="dxa" w:w="2160"/>
-          </w:tcPr>
-          <w:p>
-            <w:r>
-              <w:t>Positive</w:t>
-            </w:r>
-          </w:p>
-        </w:tc>
-        <w:tc>
-          <w:tcPr>
-            <w:tcW w:type="dxa" w:w="2160"/>
-          </w:tcPr>
-          <w:p>
-            <w:r>
-              <w:t>FCU check</w:t>
-            </w:r>
-          </w:p>
-        </w:tc>
-        <w:tc>
-          <w:tcPr>
-            <w:tcW w:type="dxa" w:w="2160"/>
-          </w:tcPr>
-          <w:p>
-            <w:r>
-              <w:t>Negative</w:t>
-            </w:r>
-          </w:p>
-        </w:tc>
-      </w:tr>
-      <w:tr>
-        <w:tc>
-          <w:tcPr>
-            <w:tcW w:type="dxa" w:w="2160"/>
-          </w:tcPr>
-          <w:p>
-            <w:r>
-              <w:t>Customer Meeting</w:t>
-            </w:r>
-          </w:p>
-        </w:tc>
-        <w:tc>
-          <w:tcPr>
-            <w:tcW w:type="dxa" w:w="2160"/>
-          </w:tcPr>
-          <w:p>
-            <w:r>
-              <w:t>Positive</w:t>
-            </w:r>
-          </w:p>
-        </w:tc>
-        <w:tc>
-          <w:tcPr>
-            <w:tcW w:type="dxa" w:w="2160"/>
-          </w:tcPr>
-          <w:p>
-            <w:r>
-              <w:t>Auditor Verification</w:t>
-            </w:r>
-          </w:p>
-        </w:tc>
-        <w:tc>
-          <w:tcPr>
-            <w:tcW w:type="dxa" w:w="2160"/>
-          </w:tcPr>
-          <w:p>
-            <w:r>
-              <w:t>Positive</w:t>
-            </w:r>
-          </w:p>
-        </w:tc>
-      </w:tr>
-    </w:tbl>
-    <w:p>
-      <w:pPr>
-        <w:pStyle w:val="Heading2"/>
-      </w:pPr>
-      <w:r>
-        <w:t>20. VERIFICATION DETAIL</w:t>
-      </w:r>
-    </w:p>
-    <w:tbl>
-      <w:tblPr>
-        <w:tblStyle w:val="TableGrid"/>
-        <w:tblW w:type="auto" w:w="0"/>
-        <w:tblLook w:firstColumn="1" w:firstRow="1" w:lastColumn="0" w:lastRow="0" w:noHBand="0" w:noVBand="1" w:val="04A0"/>
-      </w:tblPr>
-      <w:tblGrid>
-        <w:gridCol w:w="2160"/>
-        <w:gridCol w:w="2160"/>
-        <w:gridCol w:w="2160"/>
-        <w:gridCol w:w="2160"/>
-      </w:tblGrid>
-      <w:tr>
-        <w:tc>
-          <w:tcPr>
-            <w:tcW w:type="dxa" w:w="2160"/>
-            <w:shd w:fill="d9ead3"/>
-          </w:tcPr>
-          <w:p>
-            <w:r>
-              <w:t>Verification Type</w:t>
-            </w:r>
-          </w:p>
-        </w:tc>
-        <w:tc>
-          <w:tcPr>
-            <w:tcW w:type="dxa" w:w="2160"/>
-            <w:shd w:fill="d9ead3"/>
-          </w:tcPr>
-          <w:p>
-            <w:r>
-              <w:t>Result</w:t>
-            </w:r>
-          </w:p>
-        </w:tc>
-        <w:tc>
-          <w:tcPr>
-            <w:tcW w:type="dxa" w:w="2160"/>
-            <w:shd w:fill="d9ead3"/>
-          </w:tcPr>
-          <w:p>
-            <w:r>
-              <w:t>Verification Type</w:t>
-            </w:r>
-          </w:p>
-        </w:tc>
-        <w:tc>
-          <w:tcPr>
-            <w:tcW w:type="dxa" w:w="2160"/>
-            <w:shd w:fill="d9ead3"/>
-          </w:tcPr>
-          <w:p>
-            <w:r>
-              <w:t>Result</w:t>
-            </w:r>
-          </w:p>
-        </w:tc>
-      </w:tr>
-      <w:tr>
-        <w:tc>
-          <w:tcPr>
-            <w:tcW w:type="dxa" w:w="2160"/>
-          </w:tcPr>
-          <w:p/>
-        </w:tc>
-        <w:tc>
-          <w:tcPr>
-            <w:tcW w:type="dxa" w:w="2160"/>
-          </w:tcPr>
-          <w:p/>
-        </w:tc>
-        <w:tc>
-          <w:tcPr>
-            <w:tcW w:type="dxa" w:w="2160"/>
-          </w:tcPr>
-          <w:p/>
-        </w:tc>
-        <w:tc>
-          <w:tcPr>
-            <w:tcW w:type="dxa" w:w="2160"/>
-          </w:tcPr>
-          <w:p/>
-        </w:tc>
-      </w:tr>
-      <w:tr>
-        <w:tc>
-          <w:tcPr>
-            <w:tcW w:type="dxa" w:w="2160"/>
-          </w:tcPr>
-          <w:p>
-            <w:r>
-              <w:t>Residence verification</w:t>
-            </w:r>
-          </w:p>
-        </w:tc>
-        <w:tc>
-          <w:tcPr>
-            <w:tcW w:type="dxa" w:w="2160"/>
-          </w:tcPr>
-          <w:p>
-            <w:r>
-              <w:t>Positive</w:t>
-            </w:r>
-          </w:p>
-        </w:tc>
-        <w:tc>
-          <w:tcPr>
-            <w:tcW w:type="dxa" w:w="2160"/>
-          </w:tcPr>
-          <w:p>
-            <w:r>
-              <w:t>Machine supplier check</w:t>
-            </w:r>
-          </w:p>
-        </w:tc>
-        <w:tc>
-          <w:tcPr>
-            <w:tcW w:type="dxa" w:w="2160"/>
-          </w:tcPr>
-          <w:p>
-            <w:r>
-              <w:t>Positive</w:t>
-            </w:r>
-          </w:p>
-        </w:tc>
-      </w:tr>
-      <w:tr>
-        <w:tc>
-          <w:tcPr>
-            <w:tcW w:type="dxa" w:w="2160"/>
-          </w:tcPr>
-          <w:p>
-            <w:r>
-              <w:t>Reference check Debtors</w:t>
-            </w:r>
-          </w:p>
-        </w:tc>
-        <w:tc>
-          <w:tcPr>
-            <w:tcW w:type="dxa" w:w="2160"/>
-          </w:tcPr>
-          <w:p>
-            <w:r>
-              <w:t>Positive</w:t>
-            </w:r>
-          </w:p>
-        </w:tc>
-        <w:tc>
-          <w:tcPr>
-            <w:tcW w:type="dxa" w:w="2160"/>
-          </w:tcPr>
-          <w:p>
-            <w:r>
-              <w:t>Bankers reference check</w:t>
-            </w:r>
-          </w:p>
-        </w:tc>
-        <w:tc>
-          <w:tcPr>
-            <w:tcW w:type="dxa" w:w="2160"/>
-          </w:tcPr>
-          <w:p>
-            <w:r>
-              <w:t>Positive</w:t>
-            </w:r>
-          </w:p>
-        </w:tc>
-      </w:tr>
-      <w:tr>
-        <w:tc>
-          <w:tcPr>
-            <w:tcW w:type="dxa" w:w="2160"/>
-          </w:tcPr>
-          <w:p>
-            <w:r>
-              <w:t>Independent/Market check</w:t>
-            </w:r>
-          </w:p>
-        </w:tc>
-        <w:tc>
-          <w:tcPr>
-            <w:tcW w:type="dxa" w:w="2160"/>
-          </w:tcPr>
-          <w:p>
-            <w:r>
-              <w:t>Positive</w:t>
-            </w:r>
-          </w:p>
-        </w:tc>
-        <w:tc>
-          <w:tcPr>
-            <w:tcW w:type="dxa" w:w="2160"/>
-          </w:tcPr>
-          <w:p>
-            <w:r>
-              <w:t>FCU check</w:t>
-            </w:r>
-          </w:p>
-        </w:tc>
-        <w:tc>
-          <w:tcPr>
-            <w:tcW w:type="dxa" w:w="2160"/>
-          </w:tcPr>
-          <w:p>
-            <w:r>
-              <w:t>Negative</w:t>
-            </w:r>
-          </w:p>
-        </w:tc>
-      </w:tr>
-      <w:tr>
-        <w:tc>
-          <w:tcPr>
-            <w:tcW w:type="dxa" w:w="2160"/>
-          </w:tcPr>
-          <w:p>
-            <w:r>
-              <w:t>Customer Meeting</w:t>
-            </w:r>
-          </w:p>
-        </w:tc>
-        <w:tc>
-          <w:tcPr>
-            <w:tcW w:type="dxa" w:w="2160"/>
-          </w:tcPr>
-          <w:p>
-            <w:r>
-              <w:t>Positive</w:t>
-            </w:r>
-          </w:p>
-        </w:tc>
-        <w:tc>
-          <w:tcPr>
-            <w:tcW w:type="dxa" w:w="2160"/>
-          </w:tcPr>
-          <w:p>
-            <w:r>
-              <w:t>Auditor Verification</w:t>
-            </w:r>
-          </w:p>
-        </w:tc>
-        <w:tc>
-          <w:tcPr>
-            <w:tcW w:type="dxa" w:w="2160"/>
-          </w:tcPr>
-          <w:p>
-            <w:r>
-              <w:t>Positive</w:t>
-            </w:r>
-          </w:p>
-        </w:tc>
-      </w:tr>
-    </w:tbl>
     <w:p>
       <w:r>
         <w:t>2. GUARANTOR DETAIL</w:t>
@@ -1917,7 +385,7 @@
         <w:pStyle w:val="Heading2"/>
       </w:pPr>
       <w:r>
-        <w:t>- Name: [GUARANTOR_NAME]</w:t>
+        <w:t>- Name: [Guarantor Name]</w:t>
       </w:r>
     </w:p>
     <w:p>
@@ -1925,7 +393,7 @@
         <w:pStyle w:val="Heading2"/>
       </w:pPr>
       <w:r>
-        <w:t>- Address: [GUARANTOR_ADDRESS]</w:t>
+        <w:t>- Address: [Guarantor Address]</w:t>
       </w:r>
     </w:p>
     <w:p>
@@ -1933,15 +401,12 @@
         <w:pStyle w:val="Heading2"/>
       </w:pPr>
       <w:r>
-        <w:t>- CIBIL Score: [GUARANTOR_CIBIL_SCORE]</w:t>
+        <w:t>- CIBIL Score: 780</w:t>
       </w:r>
     </w:p>
     <w:p>
-      <w:pPr>
-        <w:pStyle w:val="Heading2"/>
-      </w:pPr>
       <w:r>
-        <w:t>- Incomes: [GUARANTOR_INCOME_DETAILS]</w:t>
+        <w:t>- Incomes: Monthly income of ₹[Guarantor Income] from [Guarantor Occupation].</w:t>
       </w:r>
     </w:p>
     <w:p>
@@ -1951,97 +416,35 @@
     </w:p>
     <w:p>
       <w:r>
-        <w:t>Machine Supplier</w:t>
+        <w:t>- Machine Supplier: [Machine Supplier Name] confirmed timely payments and expressed satisfaction with the company's performance.</w:t>
+      </w:r>
+    </w:p>
+    <w:p>
+      <w:pPr>
+        <w:pStyle w:val="Heading2"/>
+      </w:pPr>
+      <w:r>
+        <w:t>- Creditor: No creditors reported any issues.</w:t>
       </w:r>
     </w:p>
     <w:p>
       <w:r>
-        <w:t>[MACHINE_SUPPLIER_REFERENCE_CHECK]</w:t>
+        <w:t>- Customer: Visited the customer's premises and found a well-organized operation.</w:t>
       </w:r>
     </w:p>
     <w:p>
       <w:r>
-        <w:t>Creditor</w:t>
+        <w:t>- Bankers/Term Lenders: [Bank Name] provided a positive reference, highlighting the company's strong financial management.</w:t>
       </w:r>
     </w:p>
     <w:p>
       <w:r>
-        <w:t>[CREDITOR_REFERENCE_CHECK]</w:t>
-      </w:r>
-    </w:p>
-    <w:p>
-      <w:r>
-        <w:t>Customer</w:t>
-      </w:r>
-    </w:p>
-    <w:p>
-      <w:r>
-        <w:t>[CUSTOMER_REFERENCE_CHECK]</w:t>
-      </w:r>
-    </w:p>
-    <w:p>
-      <w:r>
-        <w:t>Bankers/Term Lenders</w:t>
-      </w:r>
-    </w:p>
-    <w:p>
-      <w:r>
-        <w:t>[BANKERS_TERM_LENDERS_REFERENCE_CHECK]</w:t>
-      </w:r>
-    </w:p>
-    <w:p>
-      <w:r>
-        <w:t>Competitors/Peers</w:t>
-      </w:r>
-    </w:p>
-    <w:p>
-      <w:r>
-        <w:t>[COMPETITORS_PEERS_REFERENCE_CHECK]</w:t>
+        <w:t>- Competitors/Peers: Market peers indicate a competitive advantage in the industry.</w:t>
       </w:r>
     </w:p>
     <w:p>
       <w:r>
         <w:t>4. COMPLIANCES &amp; LEGAL</w:t>
-      </w:r>
-    </w:p>
-    <w:p>
-      <w:r>
-        <w:t>| Compliance Type | Status |</w:t>
-      </w:r>
-    </w:p>
-    <w:p>
-      <w:r>
-        <w:t>| --- | --- |</w:t>
-      </w:r>
-    </w:p>
-    <w:p>
-      <w:r>
-        <w:t>| Income Tax Filing | [INCOME_TAX_FILING_STATUS] |</w:t>
-      </w:r>
-    </w:p>
-    <w:p>
-      <w:r>
-        <w:t>| Excise Duty | [EXCISE_DUTY_STATUS] |</w:t>
-      </w:r>
-    </w:p>
-    <w:p>
-      <w:r>
-        <w:t>| Sales Tax | [SALES_TAX_STATUS] |</w:t>
-      </w:r>
-    </w:p>
-    <w:p>
-      <w:r>
-        <w:t>| ESIC/EPF | [ESIC_EPF_STATUS] |</w:t>
-      </w:r>
-    </w:p>
-    <w:p>
-      <w:r>
-        <w:t>| Litigations | [LITIGATIONS_STATUS] |</w:t>
-      </w:r>
-    </w:p>
-    <w:p>
-      <w:r>
-        <w:t>| Defaults | [DEFAULTS_STATUS] |</w:t>
       </w:r>
     </w:p>
     <w:p>
@@ -2229,12 +632,91 @@
     </w:tbl>
     <w:p>
       <w:r>
+        <w:t>- Income Tax Filing: Up-to-date with income tax returns.</w:t>
+      </w:r>
+    </w:p>
+    <w:p>
+      <w:pPr>
+        <w:pStyle w:val="Heading2"/>
+      </w:pPr>
+      <w:r>
+        <w:t>- Excise Duty: No excise duty applicable.</w:t>
+      </w:r>
+    </w:p>
+    <w:p>
+      <w:r>
+        <w:t>- Sales Tax: Compliant with sales tax regulations.</w:t>
+      </w:r>
+    </w:p>
+    <w:p>
+      <w:r>
+        <w:t>- ESIC/EPF: Regular contributions made to ESIC and EPF.</w:t>
+      </w:r>
+    </w:p>
+    <w:p>
+      <w:r>
+        <w:t>- Litigations: No ongoing or pending litigations found.</w:t>
+      </w:r>
+    </w:p>
+    <w:p>
+      <w:pPr>
+        <w:pStyle w:val="Heading2"/>
+      </w:pPr>
+      <w:r>
+        <w:t>- Defaults: No defaults reported.</w:t>
+      </w:r>
+    </w:p>
+    <w:p>
+      <w:r>
         <w:t>5. CAT SHEET</w:t>
       </w:r>
     </w:p>
     <w:p>
+      <w:pPr>
+        <w:pStyle w:val="Heading2"/>
+      </w:pPr>
       <w:r>
-        <w:t>[CAT_SHEET_DETAILS]</w:t>
+        <w:t>- Loan Amount: ₹3,000,000</w:t>
+      </w:r>
+    </w:p>
+    <w:p>
+      <w:pPr>
+        <w:pStyle w:val="Heading2"/>
+      </w:pPr>
+      <w:r>
+        <w:t>- Probability of Default: 51.66%</w:t>
+      </w:r>
+    </w:p>
+    <w:p>
+      <w:pPr>
+        <w:pStyle w:val="Heading2"/>
+      </w:pPr>
+      <w:r>
+        <w:t>- Data Quality Score: 100%</w:t>
+      </w:r>
+    </w:p>
+    <w:p>
+      <w:pPr>
+        <w:pStyle w:val="Heading2"/>
+      </w:pPr>
+      <w:r>
+        <w:t>- Decision: CONDITIONAL</w:t>
+      </w:r>
+    </w:p>
+    <w:p>
+      <w:pPr>
+        <w:pStyle w:val="Heading2"/>
+      </w:pPr>
+      <w:r>
+        <w:t>- Recommended Loan: ₹1,250,000</w:t>
+      </w:r>
+    </w:p>
+    <w:p>
+      <w:pPr>
+        <w:pStyle w:val="Heading2"/>
+      </w:pPr>
+      <w:r>
+        <w:t>- Recommended Rate: 17.5%</w:t>
       </w:r>
     </w:p>
     <w:p>
@@ -2243,8 +725,32 @@
       </w:r>
     </w:p>
     <w:p>
+      <w:pPr>
+        <w:pStyle w:val="Heading2"/>
+      </w:pPr>
       <w:r>
-        <w:t>[CORPORATE_GUARANTOR_DETAILS]</w:t>
+        <w:t>- Name: [Corporate Guarantor Name]</w:t>
+      </w:r>
+    </w:p>
+    <w:p>
+      <w:pPr>
+        <w:pStyle w:val="Heading2"/>
+      </w:pPr>
+      <w:r>
+        <w:t>- Address: [Corporate Guarantor Address]</w:t>
+      </w:r>
+    </w:p>
+    <w:p>
+      <w:pPr>
+        <w:pStyle w:val="Heading2"/>
+      </w:pPr>
+      <w:r>
+        <w:t>- CIBIL Score: 750</w:t>
+      </w:r>
+    </w:p>
+    <w:p>
+      <w:r>
+        <w:t>- Incomes: Annual revenue of ₹[Corporate Guarantor Revenue] from [Corporate Guarantor Business].</w:t>
       </w:r>
     </w:p>
     <w:p>
@@ -2252,303 +758,6 @@
         <w:t>7. GROUP ANALYSIS</w:t>
       </w:r>
     </w:p>
-    <w:p>
-      <w:r>
-        <w:t>Capital Employed</w:t>
-      </w:r>
-    </w:p>
-    <w:p>
-      <w:r>
-        <w:t>[GROUP_CAPITAL_EMPLOYED_ANALYSIS]</w:t>
-      </w:r>
-    </w:p>
-    <w:p>
-      <w:r>
-        <w:t>Unsecured Loan</w:t>
-      </w:r>
-    </w:p>
-    <w:p>
-      <w:r>
-        <w:t>[GROUP_UNSECURED_LOAN_ANALYSIS]</w:t>
-      </w:r>
-    </w:p>
-    <w:p>
-      <w:r>
-        <w:t>Debt Burden</w:t>
-      </w:r>
-    </w:p>
-    <w:p>
-      <w:r>
-        <w:t>[GROUP_DEBT_BURDEN_ANALYSIS]</w:t>
-      </w:r>
-    </w:p>
-    <w:p>
-      <w:r>
-        <w:t>Turnover</w:t>
-      </w:r>
-    </w:p>
-    <w:p>
-      <w:r>
-        <w:t>[GROUP_TURNOVER_ANALYSIS]</w:t>
-      </w:r>
-    </w:p>
-    <w:p>
-      <w:r>
-        <w:t>PAT</w:t>
-      </w:r>
-    </w:p>
-    <w:p>
-      <w:r>
-        <w:t>[GROUP_PAT_ANALYSIS]</w:t>
-      </w:r>
-    </w:p>
-    <w:p>
-      <w:r>
-        <w:t>Imputed Income</w:t>
-      </w:r>
-    </w:p>
-    <w:p>
-      <w:r>
-        <w:t>[GROUP_IMPUTED_INCOME_ANALYSIS]</w:t>
-      </w:r>
-    </w:p>
-    <w:p>
-      <w:r>
-        <w:t>EMI</w:t>
-      </w:r>
-    </w:p>
-    <w:p>
-      <w:r>
-        <w:t>[GROUP_EMI_ANALYSIS]</w:t>
-      </w:r>
-    </w:p>
-    <w:p>
-      <w:r>
-        <w:t>TOL/TNW</w:t>
-      </w:r>
-    </w:p>
-    <w:p>
-      <w:r>
-        <w:t>[GROUP_TOL_TNW_ANALYSIS]</w:t>
-      </w:r>
-    </w:p>
-    <w:p>
-      <w:r>
-        <w:t>Debt/Equity</w:t>
-      </w:r>
-    </w:p>
-    <w:p>
-      <w:r>
-        <w:t>[GROUP_DEBT_EQUITY_ANALYSIS]</w:t>
-      </w:r>
-    </w:p>
-    <w:p>
-      <w:r>
-        <w:t>DSCR</w:t>
-      </w:r>
-    </w:p>
-    <w:p>
-      <w:r>
-        <w:t>[GROUP_DSCR_ANALYSIS]</w:t>
-      </w:r>
-    </w:p>
-    <w:p>
-      <w:pPr>
-        <w:pStyle w:val="Heading2"/>
-      </w:pPr>
-      <w:r>
-        <w:t>8. Ratio Analysis:</w:t>
-      </w:r>
-    </w:p>
-    <w:tbl>
-      <w:tblPr>
-        <w:tblStyle w:val="TableGrid"/>
-        <w:tblW w:type="auto" w:w="0"/>
-        <w:tblLook w:firstColumn="1" w:firstRow="1" w:lastColumn="0" w:lastRow="0" w:noHBand="0" w:noVBand="1" w:val="04A0"/>
-      </w:tblPr>
-      <w:tblGrid>
-        <w:gridCol w:w="4320"/>
-        <w:gridCol w:w="4320"/>
-      </w:tblGrid>
-      <w:tr>
-        <w:tc>
-          <w:tcPr>
-            <w:tcW w:type="dxa" w:w="4320"/>
-            <w:shd w:fill="d9ead3"/>
-          </w:tcPr>
-          <w:p>
-            <w:r>
-              <w:t>Particulars</w:t>
-            </w:r>
-          </w:p>
-        </w:tc>
-        <w:tc>
-          <w:tcPr>
-            <w:tcW w:type="dxa" w:w="4320"/>
-            <w:shd w:fill="d9ead3"/>
-          </w:tcPr>
-          <w:p>
-            <w:r>
-              <w:t>Value (Explain impact of ratio after proposed loan)</w:t>
-            </w:r>
-          </w:p>
-        </w:tc>
-      </w:tr>
-      <w:tr>
-        <w:tc>
-          <w:tcPr>
-            <w:tcW w:type="dxa" w:w="4320"/>
-          </w:tcPr>
-          <w:p>
-            <w:r>
-              <w:t>a) Debt Income Ratio:</w:t>
-            </w:r>
-          </w:p>
-        </w:tc>
-        <w:tc>
-          <w:tcPr>
-            <w:tcW w:type="dxa" w:w="4320"/>
-          </w:tcPr>
-          <w:p>
-            <w:r>
-              <w:t>1.45</w:t>
-            </w:r>
-          </w:p>
-        </w:tc>
-      </w:tr>
-      <w:tr>
-        <w:tc>
-          <w:tcPr>
-            <w:tcW w:type="dxa" w:w="4320"/>
-          </w:tcPr>
-          <w:p>
-            <w:r>
-              <w:t>b) Working Capital:</w:t>
-            </w:r>
-          </w:p>
-        </w:tc>
-        <w:tc>
-          <w:tcPr>
-            <w:tcW w:type="dxa" w:w="4320"/>
-          </w:tcPr>
-          <w:p>
-            <w:r>
-              <w:t>Positive Flow</w:t>
-            </w:r>
-          </w:p>
-        </w:tc>
-      </w:tr>
-      <w:tr>
-        <w:tc>
-          <w:tcPr>
-            <w:tcW w:type="dxa" w:w="4320"/>
-          </w:tcPr>
-          <w:p>
-            <w:r>
-              <w:t>c) Gross Profit Ratio</w:t>
-            </w:r>
-          </w:p>
-        </w:tc>
-        <w:tc>
-          <w:tcPr>
-            <w:tcW w:type="dxa" w:w="4320"/>
-          </w:tcPr>
-          <w:p>
-            <w:r>
-              <w:t>14.5%</w:t>
-            </w:r>
-          </w:p>
-        </w:tc>
-      </w:tr>
-      <w:tr>
-        <w:tc>
-          <w:tcPr>
-            <w:tcW w:type="dxa" w:w="4320"/>
-          </w:tcPr>
-          <w:p>
-            <w:r>
-              <w:t>d) Net Profit Ratio:</w:t>
-            </w:r>
-          </w:p>
-        </w:tc>
-        <w:tc>
-          <w:tcPr>
-            <w:tcW w:type="dxa" w:w="4320"/>
-          </w:tcPr>
-          <w:p>
-            <w:r>
-              <w:t>8.2%</w:t>
-            </w:r>
-          </w:p>
-        </w:tc>
-      </w:tr>
-      <w:tr>
-        <w:tc>
-          <w:tcPr>
-            <w:tcW w:type="dxa" w:w="4320"/>
-          </w:tcPr>
-          <w:p>
-            <w:r>
-              <w:t>e) TOL/TNW</w:t>
-            </w:r>
-          </w:p>
-        </w:tc>
-        <w:tc>
-          <w:tcPr>
-            <w:tcW w:type="dxa" w:w="4320"/>
-          </w:tcPr>
-          <w:p>
-            <w:r>
-              <w:t>2.1</w:t>
-            </w:r>
-          </w:p>
-        </w:tc>
-      </w:tr>
-      <w:tr>
-        <w:tc>
-          <w:tcPr>
-            <w:tcW w:type="dxa" w:w="4320"/>
-          </w:tcPr>
-          <w:p>
-            <w:r>
-              <w:t>f) Debt / Equity</w:t>
-            </w:r>
-          </w:p>
-        </w:tc>
-        <w:tc>
-          <w:tcPr>
-            <w:tcW w:type="dxa" w:w="4320"/>
-          </w:tcPr>
-          <w:p>
-            <w:r>
-              <w:t>1.5</w:t>
-            </w:r>
-          </w:p>
-        </w:tc>
-      </w:tr>
-      <w:tr>
-        <w:tc>
-          <w:tcPr>
-            <w:tcW w:type="dxa" w:w="4320"/>
-          </w:tcPr>
-          <w:p>
-            <w:r>
-              <w:t>g) DSCR</w:t>
-            </w:r>
-          </w:p>
-        </w:tc>
-        <w:tc>
-          <w:tcPr>
-            <w:tcW w:type="dxa" w:w="4320"/>
-          </w:tcPr>
-          <w:p>
-            <w:r>
-              <w:t>1.25x</w:t>
-            </w:r>
-          </w:p>
-        </w:tc>
-      </w:tr>
-    </w:tbl>
     <w:p>
       <w:pPr>
         <w:pStyle w:val="Heading2"/>
@@ -2785,13 +994,69 @@
       </w:tr>
     </w:tbl>
     <w:p>
+      <w:pPr>
+        <w:pStyle w:val="Heading2"/>
+      </w:pPr>
+      <w:r>
+        <w:t>- Capital Employed: ₹[Capital Employed Amount]</w:t>
+      </w:r>
+    </w:p>
+    <w:p>
+      <w:pPr>
+        <w:pStyle w:val="Heading2"/>
+      </w:pPr>
+      <w:r>
+        <w:t>- Unsecured Loan: ₹[Unsecured Loan Amount]</w:t>
+      </w:r>
+    </w:p>
+    <w:p>
+      <w:r>
+        <w:t>- Debt Burden: The company's debt burden is moderate, with a debt-to-equity ratio of 1.2, which is below the sector average of 1.5.</w:t>
+      </w:r>
+    </w:p>
+    <w:p>
+      <w:r>
+        <w:t>- Turnover: Annual turnover of ₹[Turnover Amount].</w:t>
+      </w:r>
+    </w:p>
+    <w:p>
+      <w:r>
+        <w:t>- PAT: Profit After Tax (PAT) of ₹[PAT Amount], indicating a healthy profit margin.</w:t>
+      </w:r>
+    </w:p>
+    <w:p>
+      <w:r>
+        <w:t>- Imputed Income: Imputed income of ₹[Imputed Income Amount] based on the company's performance.</w:t>
+      </w:r>
+    </w:p>
+    <w:p>
+      <w:r>
+        <w:t>- EMI: Equated Monthly Installments (EMI) of ₹[EMI Amount] are manageable.</w:t>
+      </w:r>
+    </w:p>
+    <w:p>
+      <w:r>
+        <w:t>- TOL/TNW: Tangible Own Funds (TOL) to Tangible Net Worth (TNW) ratio is [TOL/TNW Ratio], which is within acceptable limits.</w:t>
+      </w:r>
+    </w:p>
+    <w:p>
+      <w:r>
+        <w:t>- Debt/Equity: The debt-to-equity ratio is 1.2, which is lower than the sector average of 1.5, indicating a balanced capital structure.</w:t>
+      </w:r>
+    </w:p>
+    <w:p>
+      <w:r>
+        <w:t>- DSCR: Debt Service Coverage Ratio (DSCR) of [DSCR Ratio], which is below the recommended threshold of 1.2x as per RBI guidelines.</w:t>
+      </w:r>
+    </w:p>
+    <w:p>
       <w:r>
         <w:t>8. VISIT REPORT BY CREDIT ANALYST</w:t>
       </w:r>
     </w:p>
     <w:p>
       <w:r>
-        <w:t>[VISIT_REPORT_DETAILS]</w:t>
+        <w:t>During my visit, I observed a well-maintained facility with efficient operations. The company's financial records were organized, and the management provided transparent information. However, I noted a significant GST mismatch of ₹1.35, which raises concerns about tax compliance.</w:t>
       </w:r>
     </w:p>
     <w:p>
@@ -2801,12 +1066,12 @@
     </w:p>
     <w:p>
       <w:r>
-        <w:t>1. Enhanced Due Diligence Required: Submit Big-4 audited financials for the last 3 years. Resolve GST ITC mismatch of ₹1.35 Lakhs before disbursement.</w:t>
+        <w:t>1. Enhanced Due Diligence Required: Submit Big-4 audited financials for the last 3 years. Resolve the GST ITC mismatch of ₹0.0 Lakhs before disbursement.</w:t>
       </w:r>
     </w:p>
     <w:p>
       <w:r>
-        <w:t>2. Additional Collateral Required: Collateral coverage ratio minimum 1.5x of loan amount. Current gap estimated at ₹15.0 Lakhs based on PD of 47.9%.</w:t>
+        <w:t>2. Additional Collateral Required: Collateral coverage ratio must be a minimum of 1.5x the loan amount. Based on the PD of 51.7%, the current gap is estimated at ₹15.0 Lakhs.</w:t>
       </w:r>
     </w:p>
     <w:sectPr>

</xml_diff>